<commit_message>
docs(cap1): agregué las referencias
</commit_message>
<xml_diff>
--- a/capitulos/cap1_presentacion_caso.docx
+++ b/capitulos/cap1_presentacion_caso.docx
@@ -583,7 +583,6 @@
         </w:numPr>
       </w:pPr>
       <w:r>
-        <w:lastRenderedPageBreak/>
         <w:t xml:space="preserve"> Alcance </w:t>
       </w:r>
     </w:p>
@@ -620,6 +619,7 @@
         </w:numPr>
       </w:pPr>
       <w:r>
+        <w:lastRenderedPageBreak/>
         <w:t xml:space="preserve">Catálogo de paquetes turísticos hacia </w:t>
       </w:r>
       <w:proofErr w:type="spellStart"/>
@@ -799,6 +799,175 @@
       <w:r>
         <w:t>Módulo de gestión de capacidad de carga turística.</w:t>
       </w:r>
+    </w:p>
+    <w:p/>
+    <w:p/>
+    <w:p/>
+    <w:p/>
+    <w:p/>
+    <w:p/>
+    <w:p/>
+    <w:p/>
+    <w:p/>
+    <w:p/>
+    <w:p/>
+    <w:p/>
+    <w:p/>
+    <w:p/>
+    <w:p/>
+    <w:p/>
+    <w:p/>
+    <w:p/>
+    <w:p>
+      <w:pPr>
+        <w:pStyle w:val="Ttulo1"/>
+      </w:pPr>
+      <w:r>
+        <w:lastRenderedPageBreak/>
+        <w:t>REFERENCIAS BIBLIOGRÁFICAS</w:t>
+      </w:r>
+    </w:p>
+    <w:p>
+      <w:r>
+        <w:t xml:space="preserve">El </w:t>
+      </w:r>
+      <w:proofErr w:type="gramStart"/>
+      <w:r>
+        <w:t>Peruano</w:t>
+      </w:r>
+      <w:proofErr w:type="gramEnd"/>
+      <w:r>
+        <w:t xml:space="preserve">. (2026, 11 de abril). Fortaleza de </w:t>
+      </w:r>
+      <w:proofErr w:type="spellStart"/>
+      <w:r>
+        <w:t>Kuélap</w:t>
+      </w:r>
+      <w:proofErr w:type="spellEnd"/>
+      <w:r>
+        <w:t xml:space="preserve">: turismo en alza. </w:t>
+      </w:r>
+      <w:hyperlink r:id="rId5" w:history="1">
+        <w:r>
+          <w:rPr>
+            <w:rStyle w:val="Hipervnculo"/>
+          </w:rPr>
+          <w:t>https://www.elperuano.pe/noticia/293248-fortaleza-de-kuelap-turismo-en-alza</w:t>
+        </w:r>
+      </w:hyperlink>
+      <w:r>
+        <w:t xml:space="preserve"> </w:t>
+      </w:r>
+    </w:p>
+    <w:p>
+      <w:proofErr w:type="spellStart"/>
+      <w:r>
+        <w:t>Guayamiz</w:t>
+      </w:r>
+      <w:proofErr w:type="spellEnd"/>
+      <w:r>
+        <w:t xml:space="preserve">, J. (2023). Capacidad de carga turística del sendero </w:t>
+      </w:r>
+      <w:proofErr w:type="spellStart"/>
+      <w:r>
+        <w:t>Cocachimba</w:t>
+      </w:r>
+      <w:proofErr w:type="spellEnd"/>
+      <w:r>
+        <w:t xml:space="preserve"> segunda caída Catarata </w:t>
+      </w:r>
+      <w:proofErr w:type="spellStart"/>
+      <w:r>
+        <w:t>Gocta</w:t>
+      </w:r>
+      <w:proofErr w:type="spellEnd"/>
+      <w:r>
+        <w:t xml:space="preserve"> para la conservación del entorno, Amazonas 2021 [Tesis de licenciatura, Universidad Nacional Toribio Rodríguez de Mendoza de Amazonas].</w:t>
+      </w:r>
+      <w:r>
+        <w:t xml:space="preserve"> </w:t>
+      </w:r>
+    </w:p>
+    <w:p>
+      <w:proofErr w:type="spellStart"/>
+      <w:r>
+        <w:t>Lahura</w:t>
+      </w:r>
+      <w:proofErr w:type="spellEnd"/>
+      <w:r>
+        <w:t xml:space="preserve">, E., y </w:t>
+      </w:r>
+      <w:proofErr w:type="spellStart"/>
+      <w:r>
+        <w:t>Sabrera</w:t>
+      </w:r>
+      <w:proofErr w:type="spellEnd"/>
+      <w:r>
+        <w:t xml:space="preserve">, R. (s.f.). </w:t>
+      </w:r>
+      <w:proofErr w:type="spellStart"/>
+      <w:r>
+        <w:t>Kuélap</w:t>
+      </w:r>
+      <w:proofErr w:type="spellEnd"/>
+      <w:r>
+        <w:t>: el efecto de la inversión en la infraestructura sobre la demanda turística. Revista Moneda, (185), 56–59.</w:t>
+      </w:r>
+    </w:p>
+    <w:p>
+      <w:r>
+        <w:t xml:space="preserve">Martos, E. (2024). Turismo rural y desarrollo sostenible del distrito de </w:t>
+      </w:r>
+      <w:proofErr w:type="spellStart"/>
+      <w:r>
+        <w:t>Colcamar</w:t>
+      </w:r>
+      <w:proofErr w:type="spellEnd"/>
+      <w:r>
+        <w:t>, Amazonas 2022 [Tesis doctoral, Universidad Nacional Toribio Rodríguez de Mendoza de Amazonas].</w:t>
+      </w:r>
+    </w:p>
+    <w:p>
+      <w:r>
+        <w:t>Organización Mundial del Turismo. (2023). Panorama del turismo internacional. OMT.</w:t>
+      </w:r>
+    </w:p>
+    <w:p>
+      <w:r>
+        <w:t xml:space="preserve">Portal de Turismo. (2024). </w:t>
+      </w:r>
+      <w:proofErr w:type="spellStart"/>
+      <w:r>
+        <w:t>Kuélap</w:t>
+      </w:r>
+      <w:proofErr w:type="spellEnd"/>
+      <w:r>
+        <w:t xml:space="preserve"> alcanza los 100,000 visitantes desde su reapertura en 2023. </w:t>
+      </w:r>
+      <w:hyperlink r:id="rId6" w:history="1">
+        <w:r>
+          <w:rPr>
+            <w:rStyle w:val="Hipervnculo"/>
+          </w:rPr>
+          <w:t>https://portaldeturismo.pe/kuelap-alcanza-los-100000-visitantes-desde-su-reapertura-en-2023/</w:t>
+        </w:r>
+      </w:hyperlink>
+      <w:r>
+        <w:t xml:space="preserve"> </w:t>
+      </w:r>
+    </w:p>
+    <w:p>
+      <w:r>
+        <w:t xml:space="preserve">Revista de Propiedad Intelectual. (2023). Digitalización e internacionalización de los servicios peruanos. Revista de Propiedad Intelectual, (33). </w:t>
+      </w:r>
+      <w:hyperlink r:id="rId7" w:history="1">
+        <w:r>
+          <w:rPr>
+            <w:rStyle w:val="Hipervnculo"/>
+          </w:rPr>
+          <w:t>https://revista.adp.edu.pe/index.php/RPI/article/view/33</w:t>
+        </w:r>
+      </w:hyperlink>
     </w:p>
     <w:p/>
     <w:sectPr>
@@ -2407,6 +2576,29 @@
       <w:spacing w:val="5"/>
     </w:rPr>
   </w:style>
+  <w:style w:type="character" w:styleId="Hipervnculo">
+    <w:name w:val="Hyperlink"/>
+    <w:basedOn w:val="Fuentedeprrafopredeter"/>
+    <w:uiPriority w:val="99"/>
+    <w:unhideWhenUsed/>
+    <w:rsid w:val="005A479C"/>
+    <w:rPr>
+      <w:color w:val="0563C1" w:themeColor="hyperlink"/>
+      <w:u w:val="single"/>
+    </w:rPr>
+  </w:style>
+  <w:style w:type="character" w:styleId="Mencinsinresolver">
+    <w:name w:val="Unresolved Mention"/>
+    <w:basedOn w:val="Fuentedeprrafopredeter"/>
+    <w:uiPriority w:val="99"/>
+    <w:semiHidden/>
+    <w:unhideWhenUsed/>
+    <w:rsid w:val="005A479C"/>
+    <w:rPr>
+      <w:color w:val="605E5C"/>
+      <w:shd w:val="clear" w:color="auto" w:fill="E1DFDD"/>
+    </w:rPr>
+  </w:style>
 </w:styles>
 </file>
 

</xml_diff>